<commit_message>
Atualiza link do notebook
</commit_message>
<xml_diff>
--- a/MATERIAL_2027/C2/S3/DADOS3EMC2B1S3A1_desenvolvendo_juntos.docx
+++ b/MATERIAL_2027/C2/S3/DADOS3EMC2B1S3A1_desenvolvendo_juntos.docx
@@ -10,13 +10,77 @@
           <w:color w:val="000000" w:themeColor="text1"/>
         </w:rPr>
       </w:pPr>
+      <w:proofErr w:type="spellStart"/>
       <w:r>
         <w:rPr>
           <w:b/>
           <w:color w:val="000000" w:themeColor="text1"/>
           <w:sz w:val="32"/>
         </w:rPr>
-        <w:t>Roteiro de Prática Guiada</w:t>
+        <w:t>Roteiro</w:t>
+      </w:r>
+      <w:proofErr w:type="spellEnd"/>
+      <w:r>
+        <w:rPr>
+          <w:b/>
+          <w:color w:val="000000" w:themeColor="text1"/>
+          <w:sz w:val="32"/>
+        </w:rPr>
+        <w:t xml:space="preserve"> de </w:t>
+      </w:r>
+      <w:proofErr w:type="spellStart"/>
+      <w:r>
+        <w:rPr>
+          <w:b/>
+          <w:color w:val="000000" w:themeColor="text1"/>
+          <w:sz w:val="32"/>
+        </w:rPr>
+        <w:t>Prática</w:t>
+      </w:r>
+      <w:proofErr w:type="spellEnd"/>
+      <w:r>
+        <w:rPr>
+          <w:b/>
+          <w:color w:val="000000" w:themeColor="text1"/>
+          <w:sz w:val="32"/>
+        </w:rPr>
+        <w:t xml:space="preserve"> </w:t>
+      </w:r>
+      <w:proofErr w:type="spellStart"/>
+      <w:r>
+        <w:rPr>
+          <w:b/>
+          <w:color w:val="000000" w:themeColor="text1"/>
+          <w:sz w:val="32"/>
+        </w:rPr>
+        <w:t>Guiada</w:t>
+      </w:r>
+      <w:proofErr w:type="spellEnd"/>
+      <w:r>
+        <w:rPr>
+          <w:b/>
+          <w:color w:val="000000" w:themeColor="text1"/>
+          <w:sz w:val="32"/>
+        </w:rPr>
+        <w:t xml:space="preserve"> – </w:t>
+      </w:r>
+      <w:proofErr w:type="spellStart"/>
+      <w:r>
+        <w:rPr>
+          <w:b/>
+          <w:color w:val="000000" w:themeColor="text1"/>
+          <w:sz w:val="32"/>
+        </w:rPr>
+        <w:t>Desenvolvendo</w:t>
+      </w:r>
+      <w:proofErr w:type="spellEnd"/>
+      <w:r>
+        <w:rPr>
+          <w:b/>
+          <w:color w:val="000000" w:themeColor="text1"/>
+          <w:sz w:val="32"/>
+        </w:rPr>
+        <w:t xml:space="preserve"> Juntos</w:t>
       </w:r>
     </w:p>
     <w:p>
@@ -332,16 +396,9 @@
           <w:sz w:val="24"/>
           <w:szCs w:val="24"/>
         </w:rPr>
-        <w:t>: DADOS3EMC2B1S3A1_</w:t>
+        <w:t xml:space="preserve"> </w:t>
       </w:r>
-      <w:r>
-        <w:rPr>
-          <w:color w:val="000000" w:themeColor="text1"/>
-          <w:sz w:val="24"/>
-          <w:szCs w:val="24"/>
-        </w:rPr>
-        <w:t>desenvolvendo_</w:t>
-      </w:r>
+      <w:proofErr w:type="spellStart"/>
       <w:proofErr w:type="gramStart"/>
       <w:r>
         <w:rPr>
@@ -349,15 +406,16 @@
           <w:sz w:val="24"/>
           <w:szCs w:val="24"/>
         </w:rPr>
-        <w:t>juntos</w:t>
+        <w:t>pelo</w:t>
       </w:r>
+      <w:proofErr w:type="spellEnd"/>
       <w:r>
         <w:rPr>
           <w:color w:val="000000" w:themeColor="text1"/>
           <w:sz w:val="24"/>
           <w:szCs w:val="24"/>
         </w:rPr>
-        <w:t>.ipynb</w:t>
+        <w:t xml:space="preserve">  link</w:t>
       </w:r>
       <w:proofErr w:type="gramEnd"/>
       <w:r>
@@ -366,8 +424,29 @@
           <w:sz w:val="24"/>
           <w:szCs w:val="24"/>
         </w:rPr>
-        <w:t>.</w:t>
+        <w:t xml:space="preserve">: </w:t>
       </w:r>
+      <w:hyperlink r:id="rId8" w:history="1">
+        <w:r>
+          <w:rPr>
+            <w:rStyle w:val="Hyperlink"/>
+            <w:sz w:val="24"/>
+            <w:szCs w:val="24"/>
+          </w:rPr>
+          <w:t>https://github.com/ept-seduc-sp/dados-ano2/blob/main/MATERIAL_2027/C2/S3/DADOS3EMC2B1S3A1_desenvolvendo_juntos.ipynb</w:t>
+        </w:r>
+      </w:hyperlink>
+    </w:p>
+    <w:p>
+      <w:pPr>
+        <w:spacing w:after="20"/>
+        <w:ind w:left="288" w:hanging="173"/>
+        <w:rPr>
+          <w:color w:val="000000" w:themeColor="text1"/>
+          <w:sz w:val="24"/>
+          <w:szCs w:val="24"/>
+        </w:rPr>
+      </w:pPr>
     </w:p>
     <w:p>
       <w:pPr>
@@ -578,6 +657,7 @@
           <w:sz w:val="24"/>
           <w:szCs w:val="24"/>
         </w:rPr>
+        <w:lastRenderedPageBreak/>
         <w:t>Passo 4 — Registre a regra provisória</w:t>
       </w:r>
     </w:p>
@@ -603,7 +683,6 @@
           <w:sz w:val="24"/>
           <w:szCs w:val="24"/>
         </w:rPr>
-        <w:lastRenderedPageBreak/>
         <w:t>__________________________________________________</w:t>
       </w:r>
       <w:r>
@@ -707,8 +786,8 @@
       </w:r>
     </w:p>
     <w:sectPr>
-      <w:headerReference w:type="default" r:id="rId8"/>
-      <w:footerReference w:type="default" r:id="rId9"/>
+      <w:headerReference w:type="default" r:id="rId9"/>
+      <w:footerReference w:type="default" r:id="rId10"/>
       <w:pgSz w:w="12240" w:h="15840"/>
       <w:pgMar w:top="648" w:right="864" w:bottom="648" w:left="864" w:header="720" w:footer="720" w:gutter="0"/>
       <w:cols w:space="720"/>
@@ -12519,6 +12598,29 @@
       </w:tcPr>
     </w:tblStylePr>
   </w:style>
+  <w:style w:type="character" w:styleId="Hyperlink">
+    <w:name w:val="Hyperlink"/>
+    <w:basedOn w:val="Fontepargpadro"/>
+    <w:uiPriority w:val="99"/>
+    <w:unhideWhenUsed/>
+    <w:rsid w:val="00B04B28"/>
+    <w:rPr>
+      <w:color w:val="0000FF" w:themeColor="hyperlink"/>
+      <w:u w:val="single"/>
+    </w:rPr>
+  </w:style>
+  <w:style w:type="character" w:styleId="MenoPendente">
+    <w:name w:val="Unresolved Mention"/>
+    <w:basedOn w:val="Fontepargpadro"/>
+    <w:uiPriority w:val="99"/>
+    <w:semiHidden/>
+    <w:unhideWhenUsed/>
+    <w:rsid w:val="00B04B28"/>
+    <w:rPr>
+      <w:color w:val="605E5C"/>
+      <w:shd w:val="clear" w:color="auto" w:fill="E1DFDD"/>
+    </w:rPr>
+  </w:style>
 </w:styles>
 </file>
 

</xml_diff>